<commit_message>
Update tenant T.C. numbers and contract date
Set Rahmet Japbarov (99419957036) and Bazargul Tyllayeva (99458955734)
with the "T.C." prefix removed (numbers in parentheses), and change the
rental-contract date in the body from 15/07/2026 to 05/07/2026.

Co-Authored-By: Claude Opus 4.8 <noreply@anthropic.com>
Claude-Session: https://claude.ai/code/session_01H5HcujH8KDfuuqxorQiE7J
</commit_message>
<xml_diff>
--- a/Tahliye_Taahhutnamesi.docx
+++ b/Tahliye_Taahhutnamesi.docx
@@ -62,7 +62,7 @@
           <w:b w:val="0"/>
           <w:sz w:val="22"/>
         </w:rPr>
-        <w:t>1) RAHMET JAPBAROV (T.C. ______________ )</w:t>
+        <w:t>1) RAHMET JAPBAROV (99419957036)</w:t>
       </w:r>
       <w:r>
         <w:br/>
@@ -82,7 +82,7 @@
           <w:b w:val="0"/>
           <w:sz w:val="22"/>
         </w:rPr>
-        <w:t>2) BAZARGUL TYLLAYEVA (T.C. ______________ )</w:t>
+        <w:t>2) BAZARGUL TYLLAYEVA (99458955734)</w:t>
       </w:r>
       <w:r>
         <w:br/>
@@ -325,7 +325,7 @@
           <w:b w:val="0"/>
           <w:sz w:val="22"/>
         </w:rPr>
-        <w:t>15/07/2026 tarihli kira sözleşmesi uyarınca;"Atatürk Mah. Gonca Sokak 4/4 Ümraniye/İstanbul " adresinde kiracı olarak bulunduğum taşınmazı, hiçbir ihtar ve ihbara gerek kalmadan kayıtsız ve şartsız olarak, 6098 sayılı Türk Borçlar Kanunu'nun 350,351 ve 352. maddeleri gereğince, 31 Ocak 2027 (Otuzbir Ocak 2027) tarihinde, borçsuz olarak boş ve sağlam olarak taşınmaz maliklerine tahliye ve teslim edeceğimi beyan, kabul ve taahhüt ederim. Taahhüt tarihinde taşınmazı tahliye etmemem halinde mal sahiplerinin; icrai takibata geçerek yapacağı tüm masrafları ve tahliyeyi geciktirmemden dolayı uğrayacağı zararı ihtar ve gerek kalmadan nakden ve peşin ödeyeceğimi beyan, kabul ve taahhüt ederim. 31 /10/2026</w:t>
+        <w:t>05/07/2026 tarihli kira sözleşmesi uyarınca;"Atatürk Mah. Gonca Sokak 4/4 Ümraniye/İstanbul " adresinde kiracı olarak bulunduğum taşınmazı, hiçbir ihtar ve ihbara gerek kalmadan kayıtsız ve şartsız olarak, 6098 sayılı Türk Borçlar Kanunu'nun 350,351 ve 352. maddeleri gereğince, 31 Ocak 2027 (Otuzbir Ocak 2027) tarihinde, borçsuz olarak boş ve sağlam olarak taşınmaz maliklerine tahliye ve teslim edeceğimi beyan, kabul ve taahhüt ederim. Taahhüt tarihinde taşınmazı tahliye etmemem halinde mal sahiplerinin; icrai takibata geçerek yapacağı tüm masrafları ve tahliyeyi geciktirmemden dolayı uğrayacağı zararı ihtar ve gerek kalmadan nakden ve peşin ödeyeceğimi beyan, kabul ve taahhüt ederim. 31 /10/2026</w:t>
       </w:r>
     </w:p>
     <w:p>

</xml_diff>